<commit_message>
Refine portfolio typography and content
</commit_message>
<xml_diff>
--- a/public/resume/mohamed-moheyeldin-resume-detailed.docx
+++ b/public/resume/mohamed-moheyeldin-resume-detailed.docx
@@ -98,9 +98,6 @@
         <w:br/>
         <w:br/>
         <w:t>Combines hands-on framework engineering with technical leadership: defining test strategy, automation roadmaps, framework standards, risk-based testing, release-readiness criteria, and quality engineering practices while remaining active in development, debugging, code review, test implementation, and failure analysis.</w:t>
-        <w:br/>
-        <w:br/>
-        <w:t>Uses ChatGPT, Codex, GitHub Copilot, Microsoft Copilot, and local language models for development, test design, debugging, documentation, code review, and daily engineering tasks, with human verification and automated quality gates protecting the final result.</w:t>
       </w:r>
     </w:p>
     <w:p>
@@ -144,7 +141,7 @@
           <w:color w:val="0B1020"/>
           <w:sz w:val="18"/>
         </w:rPr>
-        <w:t>Test Automation Architecture  |  UI and API Testing  |  CI/CD Quality Gates  |  Manual and Exploratory Testing  |  Risk-Based Testing  |  Team Leadership and Mentoring  |  AI-Assisted Software Engineering  |  Multi-Agent Orchestration  |  Local AI and Retrieval-Augmented Generation</w:t>
+        <w:t>Test Automation Architecture  |  UI and API Testing  |  CI/CD Quality Gates  |  Manual and Exploratory Testing  |  Risk-Based Testing  |  Team Leadership and Mentoring</w:t>
       </w:r>
     </w:p>
     <w:p>
@@ -299,61 +296,6 @@
           <w:sz w:val="18"/>
         </w:rPr>
         <w:t>TestNG, JUnit, Mocha, Chai, Jest, Selenium Grid, Applitools Eyes</w:t>
-      </w:r>
-    </w:p>
-    <w:p>
-      <w:pPr>
-        <w:spacing w:after="60"/>
-      </w:pPr>
-      <w:r>
-        <w:rPr>
-          <w:rFonts w:ascii="Arial" w:hAnsi="Arial"/>
-          <w:b/>
-          <w:i w:val="0"/>
-          <w:color w:val="0B1020"/>
-          <w:sz w:val="18"/>
-        </w:rPr>
-        <w:t xml:space="preserve">AI engineering: </w:t>
-      </w:r>
-      <w:r>
-        <w:rPr>
-          <w:rFonts w:ascii="Arial" w:hAnsi="Arial"/>
-          <w:b w:val="0"/>
-          <w:i w:val="0"/>
-          <w:color w:val="4D5568"/>
-          <w:sz w:val="18"/>
-        </w:rPr>
-        <w:t>ChatGPT, OpenAI Codex, GitHub Copilot, Microsoft Copilot, Local LLMs, Multi-Agent Orchestration, Retrieval-Augmented Generation, Prompt and Context Engineering</w:t>
-      </w:r>
-    </w:p>
-    <w:p>
-      <w:pPr>
-        <w:spacing w:after="60"/>
-      </w:pPr>
-      <w:r>
-        <w:rPr>
-          <w:rFonts w:ascii="Arial" w:hAnsi="Arial"/>
-          <w:b/>
-          <w:i w:val="0"/>
-          <w:color w:val="0B1020"/>
-          <w:sz w:val="18"/>
-        </w:rPr>
-        <w:t xml:space="preserve">Local AI &amp; optimization: </w:t>
-      </w:r>
-      <w:r>
-        <w:rPr>
-          <w:rFonts w:ascii="Arial" w:hAnsi="Arial"/>
-          <w:b w:val="0"/>
-          <w:i w:val="0"/>
-          <w:color w:val="4D5568"/>
-          <w:sz w:val="18"/>
-        </w:rPr>
-        <w:t>Ollama, llama.cpp, GGUF, Model Quantization, ONNX Runtime, OpenVINO, Qdrant, FastEmbed, LangGraph, Semantic Kernel</w:t>
-      </w:r>
-    </w:p>
-    <w:p>
-      <w:r>
-        <w:br w:type="page"/>
       </w:r>
     </w:p>
     <w:p>
@@ -577,11 +519,6 @@
           <w:sz w:val="18"/>
         </w:rPr>
         <w:t>Configured Selenium Grid for parallel cross-browser testing and JMeter performance benchmarks.</w:t>
-      </w:r>
-    </w:p>
-    <w:p>
-      <w:r>
-        <w:br w:type="page"/>
       </w:r>
     </w:p>
     <w:p>
@@ -922,191 +859,6 @@
       </w:r>
     </w:p>
     <w:p>
-      <w:r>
-        <w:br w:type="page"/>
-      </w:r>
-    </w:p>
-    <w:p>
-      <w:pPr>
-        <w:keepNext/>
-        <w:spacing w:before="200" w:after="80"/>
-        <w:pBdr>
-          <w:bottom w:val="single" w:sz="4" w:space="3" w:color="DFE3EB"/>
-        </w:pBdr>
-      </w:pPr>
-      <w:r>
-        <w:rPr>
-          <w:rFonts w:ascii="Arial" w:hAnsi="Arial"/>
-          <w:b/>
-          <w:i w:val="0"/>
-          <w:color w:val="0B1020"/>
-          <w:sz w:val="20"/>
-        </w:rPr>
-        <w:t xml:space="preserve">AI ENGINEERING </w:t>
-      </w:r>
-      <w:r>
-        <w:rPr>
-          <w:rFonts w:ascii="Arial" w:hAnsi="Arial"/>
-          <w:b/>
-          <w:i w:val="0"/>
-          <w:color w:val="1267E8"/>
-          <w:sz w:val="20"/>
-        </w:rPr>
-        <w:t>PRACTICE</w:t>
-      </w:r>
-    </w:p>
-    <w:p>
-      <w:pPr>
-        <w:spacing w:after="100" w:line="269" w:lineRule="auto"/>
-      </w:pPr>
-      <w:r>
-        <w:rPr>
-          <w:rFonts w:ascii="Arial" w:hAnsi="Arial"/>
-          <w:b w:val="0"/>
-          <w:i w:val="0"/>
-          <w:color w:val="0B1020"/>
-          <w:sz w:val="18"/>
-        </w:rPr>
-        <w:t>An active local-first AI engineering system that decomposes complex work into specialized subtasks, routes each subtask to the model best suited to the problem and available hardware, runs independent work in parallel, and synthesizes the results into one verified response.</w:t>
-      </w:r>
-    </w:p>
-    <w:p>
-      <w:pPr>
-        <w:pStyle w:val="ListBullet"/>
-        <w:spacing w:after="64" w:line="259" w:lineRule="auto"/>
-        <w:ind w:left="317" w:hanging="173"/>
-      </w:pPr>
-      <w:r>
-        <w:rPr>
-          <w:rFonts w:ascii="Arial" w:hAnsi="Arial"/>
-          <w:b w:val="0"/>
-          <w:i w:val="0"/>
-          <w:color w:val="0B1020"/>
-          <w:sz w:val="18"/>
-        </w:rPr>
-        <w:t>Designed an orchestration layer that classifies requests, decomposes complex work, routes subtasks by capability and hardware cost, and merges parallel agent results into one traceable answer.</w:t>
-      </w:r>
-    </w:p>
-    <w:p>
-      <w:pPr>
-        <w:pStyle w:val="ListBullet"/>
-        <w:spacing w:after="64" w:line="259" w:lineRule="auto"/>
-        <w:ind w:left="317" w:hanging="173"/>
-      </w:pPr>
-      <w:r>
-        <w:rPr>
-          <w:rFonts w:ascii="Arial" w:hAnsi="Arial"/>
-          <w:b w:val="0"/>
-          <w:i w:val="0"/>
-          <w:color w:val="0B1020"/>
-          <w:sz w:val="18"/>
-        </w:rPr>
-        <w:t>Built a Git-aware repository indexer that detects working-tree and remote-branch changes, incrementally refreshes affected files, and preserves project knowledge between AI sessions.</w:t>
-      </w:r>
-    </w:p>
-    <w:p>
-      <w:pPr>
-        <w:pStyle w:val="ListBullet"/>
-        <w:spacing w:after="64" w:line="259" w:lineRule="auto"/>
-        <w:ind w:left="317" w:hanging="173"/>
-      </w:pPr>
-      <w:r>
-        <w:rPr>
-          <w:rFonts w:ascii="Arial" w:hAnsi="Arial"/>
-          <w:b w:val="0"/>
-          <w:i w:val="0"/>
-          <w:color w:val="0B1020"/>
-          <w:sz w:val="18"/>
-        </w:rPr>
-        <w:t>Created a retrieval-augmented context layer combining semantic embeddings, keyword recall, file metadata, symbols, dependencies, tests, and change history.</w:t>
-      </w:r>
-    </w:p>
-    <w:p>
-      <w:pPr>
-        <w:pStyle w:val="ListBullet"/>
-        <w:spacing w:after="64" w:line="259" w:lineRule="auto"/>
-        <w:ind w:left="317" w:hanging="173"/>
-      </w:pPr>
-      <w:r>
-        <w:rPr>
-          <w:rFonts w:ascii="Arial" w:hAnsi="Arial"/>
-          <w:b w:val="0"/>
-          <w:i w:val="0"/>
-          <w:color w:val="0B1020"/>
-          <w:sz w:val="18"/>
-        </w:rPr>
-        <w:t>Prepared compact, source-linked context packets locally before selective escalation to ChatGPT, Codex, GitHub Copilot, Microsoft Copilot, or another cloud service.</w:t>
-      </w:r>
-    </w:p>
-    <w:p>
-      <w:pPr>
-        <w:pStyle w:val="ListBullet"/>
-        <w:spacing w:after="64" w:line="259" w:lineRule="auto"/>
-        <w:ind w:left="317" w:hanging="173"/>
-      </w:pPr>
-      <w:r>
-        <w:rPr>
-          <w:rFonts w:ascii="Arial" w:hAnsi="Arial"/>
-          <w:b w:val="0"/>
-          <w:i w:val="0"/>
-          <w:color w:val="0B1020"/>
-          <w:sz w:val="18"/>
-        </w:rPr>
-        <w:t>Applied AI across frontend development, automation framework design, test generation, debugging, code review, documentation, failure analysis, and daily engineering workflows.</w:t>
-      </w:r>
-    </w:p>
-    <w:p>
-      <w:pPr>
-        <w:pStyle w:val="ListBullet"/>
-        <w:spacing w:after="64" w:line="259" w:lineRule="auto"/>
-        <w:ind w:left="317" w:hanging="173"/>
-      </w:pPr>
-      <w:r>
-        <w:rPr>
-          <w:rFonts w:ascii="Arial" w:hAnsi="Arial"/>
-          <w:b w:val="0"/>
-          <w:i w:val="0"/>
-          <w:color w:val="0B1020"/>
-          <w:sz w:val="18"/>
-        </w:rPr>
-        <w:t>Designed local-first fallbacks so routine work can continue without usage quotas while sensitive repository context remains on the workstation unless a deliberate cloud handoff is required.</w:t>
-      </w:r>
-    </w:p>
-    <w:p>
-      <w:pPr>
-        <w:pStyle w:val="ListBullet"/>
-        <w:spacing w:after="64" w:line="259" w:lineRule="auto"/>
-        <w:ind w:left="317" w:hanging="173"/>
-      </w:pPr>
-      <w:r>
-        <w:rPr>
-          <w:rFonts w:ascii="Arial" w:hAnsi="Arial"/>
-          <w:b w:val="0"/>
-          <w:i w:val="0"/>
-          <w:color w:val="0B1020"/>
-          <w:sz w:val="18"/>
-        </w:rPr>
-        <w:t>Experimented with GGUF model packaging, quantization, llama.cpp, Ollama, ONNX Runtime, and OpenVINO to balance memory use, throughput, latency, and response quality.</w:t>
-      </w:r>
-    </w:p>
-    <w:p>
-      <w:pPr>
-        <w:pStyle w:val="ListBullet"/>
-        <w:spacing w:after="64" w:line="259" w:lineRule="auto"/>
-        <w:ind w:left="317" w:hanging="173"/>
-      </w:pPr>
-      <w:r>
-        <w:rPr>
-          <w:rFonts w:ascii="Arial" w:hAnsi="Arial"/>
-          <w:b w:val="0"/>
-          <w:i w:val="0"/>
-          <w:color w:val="0B1020"/>
-          <w:sz w:val="18"/>
-        </w:rPr>
-        <w:t>Added verification stages that compare agent conclusions with source files, tests, and command output before synthesized results are accepted.</w:t>
-      </w:r>
-    </w:p>
-    <w:p>
       <w:pPr>
         <w:keepNext/>
         <w:spacing w:before="200" w:after="80"/>
@@ -1147,7 +899,7 @@
           <w:color w:val="0B1020"/>
           <w:sz w:val="18"/>
         </w:rPr>
-        <w:t>A schema-driven Astro platform that keeps the website portfolio, browser resume, and future PDF and DOCX outputs aligned through one validated professional data source.</w:t>
+        <w:t>A connected UI, API, CI/CD, cloud-environment, and diagnostics strategy for complex federal software delivery.</w:t>
       </w:r>
     </w:p>
     <w:p>
@@ -1164,7 +916,7 @@
           <w:color w:val="0B1020"/>
           <w:sz w:val="18"/>
         </w:rPr>
-        <w:t>Designed one structured content architecture for every career presentation channel.</w:t>
+        <w:t>Multi-layer UI and API automation architecture</w:t>
       </w:r>
     </w:p>
     <w:p>
@@ -1181,7 +933,7 @@
           <w:color w:val="0B1020"/>
           <w:sz w:val="18"/>
         </w:rPr>
-        <w:t>Built accessible, responsive pages with zero client-framework runtime.</w:t>
+        <w:t>Parallel CI execution with complete diagnostic artifacts</w:t>
       </w:r>
     </w:p>
     <w:p>
@@ -1198,7 +950,7 @@
           <w:color w:val="0B1020"/>
           <w:sz w:val="18"/>
         </w:rPr>
-        <w:t>Added strict diagnostics, browser journeys, automated accessibility analysis, and continuous deployment.</w:t>
+        <w:t>Risk-based failure prioritization and automated defect triage</w:t>
       </w:r>
     </w:p>
     <w:p>
@@ -1215,7 +967,7 @@
           <w:color w:val="0B1020"/>
           <w:sz w:val="18"/>
         </w:rPr>
-        <w:t>Prepared separate PDF and DOCX presentation contracts without duplicating career facts.</w:t>
+        <w:t>Technical leadership for a five-engineer automation team</w:t>
       </w:r>
     </w:p>
     <w:p>

</xml_diff>